<commit_message>
Hoàn thiện bài 2_1 state pattern và cập nhật minh chứng
</commit_message>
<xml_diff>
--- a/KTTKPM_DangNguyenTienPhat_22728941_Tuan03/KTTKPM_DangNguyenTienPhat_22728941_Tuan03.docx
+++ b/KTTKPM_DangNguyenTienPhat_22728941_Tuan03/KTTKPM_DangNguyenTienPhat_22728941_Tuan03.docx
@@ -869,10 +869,9 @@
         <w:rPr>
           <w:lang w:val="en-AU"/>
         </w:rPr>
+        <w:lastRenderedPageBreak/>
         <w:t>- State</w:t>
       </w:r>
-      <w:bookmarkStart w:id="3" w:name="_GoBack"/>
-      <w:bookmarkEnd w:id="3"/>
     </w:p>
     <w:p>
       <w:pPr>
@@ -886,6 +885,7 @@
           <w:noProof/>
           <w:lang w:val="en-AU" w:eastAsia="en-AU"/>
         </w:rPr>
+        <w:lastRenderedPageBreak/>
         <w:drawing>
           <wp:inline distT="0" distB="0" distL="0" distR="0">
             <wp:extent cx="5943600" cy="3430270"/>
@@ -928,6 +928,329 @@
           </wp:inline>
         </w:drawing>
       </w:r>
+      <w:r>
+        <w:rPr>
+          <w:lang w:val="en-AU"/>
+        </w:rPr>
+        <w:drawing>
+          <wp:inline distT="0" distB="0" distL="0" distR="0" wp14:anchorId="67A64C57" wp14:editId="20B67202">
+            <wp:extent cx="5943600" cy="3343275"/>
+            <wp:effectExtent l="0" t="0" r="0" b="9525"/>
+            <wp:docPr id="2" name="Picture 2"/>
+            <wp:cNvGraphicFramePr>
+              <a:graphicFrameLocks xmlns:a="http://schemas.openxmlformats.org/drawingml/2006/main" noChangeAspect="1"/>
+            </wp:cNvGraphicFramePr>
+            <a:graphic xmlns:a="http://schemas.openxmlformats.org/drawingml/2006/main">
+              <a:graphicData uri="http://schemas.openxmlformats.org/drawingml/2006/picture">
+                <pic:pic xmlns:pic="http://schemas.openxmlformats.org/drawingml/2006/picture">
+                  <pic:nvPicPr>
+                    <pic:cNvPr id="1" name=""/>
+                    <pic:cNvPicPr/>
+                  </pic:nvPicPr>
+                  <pic:blipFill>
+                    <a:blip r:embed="rId6"/>
+                    <a:stretch>
+                      <a:fillRect/>
+                    </a:stretch>
+                  </pic:blipFill>
+                  <pic:spPr>
+                    <a:xfrm>
+                      <a:off x="0" y="0"/>
+                      <a:ext cx="5943600" cy="3343275"/>
+                    </a:xfrm>
+                    <a:prstGeom prst="rect">
+                      <a:avLst/>
+                    </a:prstGeom>
+                  </pic:spPr>
+                </pic:pic>
+              </a:graphicData>
+            </a:graphic>
+          </wp:inline>
+        </w:drawing>
+      </w:r>
+      <w:r>
+        <w:rPr>
+          <w:lang w:val="en-AU"/>
+        </w:rPr>
+        <w:lastRenderedPageBreak/>
+        <w:drawing>
+          <wp:inline distT="0" distB="0" distL="0" distR="0" wp14:anchorId="7F999595" wp14:editId="35B3C4A6">
+            <wp:extent cx="5943600" cy="3343275"/>
+            <wp:effectExtent l="0" t="0" r="0" b="9525"/>
+            <wp:docPr id="3" name="Picture 3"/>
+            <wp:cNvGraphicFramePr>
+              <a:graphicFrameLocks xmlns:a="http://schemas.openxmlformats.org/drawingml/2006/main" noChangeAspect="1"/>
+            </wp:cNvGraphicFramePr>
+            <a:graphic xmlns:a="http://schemas.openxmlformats.org/drawingml/2006/main">
+              <a:graphicData uri="http://schemas.openxmlformats.org/drawingml/2006/picture">
+                <pic:pic xmlns:pic="http://schemas.openxmlformats.org/drawingml/2006/picture">
+                  <pic:nvPicPr>
+                    <pic:cNvPr id="1" name=""/>
+                    <pic:cNvPicPr/>
+                  </pic:nvPicPr>
+                  <pic:blipFill>
+                    <a:blip r:embed="rId7"/>
+                    <a:stretch>
+                      <a:fillRect/>
+                    </a:stretch>
+                  </pic:blipFill>
+                  <pic:spPr>
+                    <a:xfrm>
+                      <a:off x="0" y="0"/>
+                      <a:ext cx="5943600" cy="3343275"/>
+                    </a:xfrm>
+                    <a:prstGeom prst="rect">
+                      <a:avLst/>
+                    </a:prstGeom>
+                  </pic:spPr>
+                </pic:pic>
+              </a:graphicData>
+            </a:graphic>
+          </wp:inline>
+        </w:drawing>
+      </w:r>
+      <w:r>
+        <w:rPr>
+          <w:lang w:val="en-AU"/>
+        </w:rPr>
+        <w:drawing>
+          <wp:inline distT="0" distB="0" distL="0" distR="0" wp14:anchorId="66323610" wp14:editId="271EF20F">
+            <wp:extent cx="5943600" cy="3343275"/>
+            <wp:effectExtent l="0" t="0" r="0" b="9525"/>
+            <wp:docPr id="4" name="Picture 4"/>
+            <wp:cNvGraphicFramePr>
+              <a:graphicFrameLocks xmlns:a="http://schemas.openxmlformats.org/drawingml/2006/main" noChangeAspect="1"/>
+            </wp:cNvGraphicFramePr>
+            <a:graphic xmlns:a="http://schemas.openxmlformats.org/drawingml/2006/main">
+              <a:graphicData uri="http://schemas.openxmlformats.org/drawingml/2006/picture">
+                <pic:pic xmlns:pic="http://schemas.openxmlformats.org/drawingml/2006/picture">
+                  <pic:nvPicPr>
+                    <pic:cNvPr id="1" name=""/>
+                    <pic:cNvPicPr/>
+                  </pic:nvPicPr>
+                  <pic:blipFill>
+                    <a:blip r:embed="rId8"/>
+                    <a:stretch>
+                      <a:fillRect/>
+                    </a:stretch>
+                  </pic:blipFill>
+                  <pic:spPr>
+                    <a:xfrm>
+                      <a:off x="0" y="0"/>
+                      <a:ext cx="5943600" cy="3343275"/>
+                    </a:xfrm>
+                    <a:prstGeom prst="rect">
+                      <a:avLst/>
+                    </a:prstGeom>
+                  </pic:spPr>
+                </pic:pic>
+              </a:graphicData>
+            </a:graphic>
+          </wp:inline>
+        </w:drawing>
+      </w:r>
+      <w:r>
+        <w:rPr>
+          <w:lang w:val="en-AU"/>
+        </w:rPr>
+        <w:lastRenderedPageBreak/>
+        <w:drawing>
+          <wp:inline distT="0" distB="0" distL="0" distR="0" wp14:anchorId="6C58123C" wp14:editId="469DD25B">
+            <wp:extent cx="5943600" cy="3343275"/>
+            <wp:effectExtent l="0" t="0" r="0" b="9525"/>
+            <wp:docPr id="5" name="Picture 5"/>
+            <wp:cNvGraphicFramePr>
+              <a:graphicFrameLocks xmlns:a="http://schemas.openxmlformats.org/drawingml/2006/main" noChangeAspect="1"/>
+            </wp:cNvGraphicFramePr>
+            <a:graphic xmlns:a="http://schemas.openxmlformats.org/drawingml/2006/main">
+              <a:graphicData uri="http://schemas.openxmlformats.org/drawingml/2006/picture">
+                <pic:pic xmlns:pic="http://schemas.openxmlformats.org/drawingml/2006/picture">
+                  <pic:nvPicPr>
+                    <pic:cNvPr id="1" name=""/>
+                    <pic:cNvPicPr/>
+                  </pic:nvPicPr>
+                  <pic:blipFill>
+                    <a:blip r:embed="rId9"/>
+                    <a:stretch>
+                      <a:fillRect/>
+                    </a:stretch>
+                  </pic:blipFill>
+                  <pic:spPr>
+                    <a:xfrm>
+                      <a:off x="0" y="0"/>
+                      <a:ext cx="5943600" cy="3343275"/>
+                    </a:xfrm>
+                    <a:prstGeom prst="rect">
+                      <a:avLst/>
+                    </a:prstGeom>
+                  </pic:spPr>
+                </pic:pic>
+              </a:graphicData>
+            </a:graphic>
+          </wp:inline>
+        </w:drawing>
+      </w:r>
+      <w:r>
+        <w:rPr>
+          <w:lang w:val="en-AU"/>
+        </w:rPr>
+        <w:drawing>
+          <wp:inline distT="0" distB="0" distL="0" distR="0" wp14:anchorId="188C9BEC" wp14:editId="6787C14C">
+            <wp:extent cx="5943600" cy="3343275"/>
+            <wp:effectExtent l="0" t="0" r="0" b="9525"/>
+            <wp:docPr id="6" name="Picture 6"/>
+            <wp:cNvGraphicFramePr>
+              <a:graphicFrameLocks xmlns:a="http://schemas.openxmlformats.org/drawingml/2006/main" noChangeAspect="1"/>
+            </wp:cNvGraphicFramePr>
+            <a:graphic xmlns:a="http://schemas.openxmlformats.org/drawingml/2006/main">
+              <a:graphicData uri="http://schemas.openxmlformats.org/drawingml/2006/picture">
+                <pic:pic xmlns:pic="http://schemas.openxmlformats.org/drawingml/2006/picture">
+                  <pic:nvPicPr>
+                    <pic:cNvPr id="1" name=""/>
+                    <pic:cNvPicPr/>
+                  </pic:nvPicPr>
+                  <pic:blipFill>
+                    <a:blip r:embed="rId10"/>
+                    <a:stretch>
+                      <a:fillRect/>
+                    </a:stretch>
+                  </pic:blipFill>
+                  <pic:spPr>
+                    <a:xfrm>
+                      <a:off x="0" y="0"/>
+                      <a:ext cx="5943600" cy="3343275"/>
+                    </a:xfrm>
+                    <a:prstGeom prst="rect">
+                      <a:avLst/>
+                    </a:prstGeom>
+                  </pic:spPr>
+                </pic:pic>
+              </a:graphicData>
+            </a:graphic>
+          </wp:inline>
+        </w:drawing>
+      </w:r>
+      <w:r>
+        <w:rPr>
+          <w:lang w:val="en-AU"/>
+        </w:rPr>
+        <w:lastRenderedPageBreak/>
+        <w:drawing>
+          <wp:inline distT="0" distB="0" distL="0" distR="0" wp14:anchorId="35F8E825" wp14:editId="0EDB9364">
+            <wp:extent cx="5943600" cy="3343275"/>
+            <wp:effectExtent l="0" t="0" r="0" b="9525"/>
+            <wp:docPr id="7" name="Picture 7"/>
+            <wp:cNvGraphicFramePr>
+              <a:graphicFrameLocks xmlns:a="http://schemas.openxmlformats.org/drawingml/2006/main" noChangeAspect="1"/>
+            </wp:cNvGraphicFramePr>
+            <a:graphic xmlns:a="http://schemas.openxmlformats.org/drawingml/2006/main">
+              <a:graphicData uri="http://schemas.openxmlformats.org/drawingml/2006/picture">
+                <pic:pic xmlns:pic="http://schemas.openxmlformats.org/drawingml/2006/picture">
+                  <pic:nvPicPr>
+                    <pic:cNvPr id="1" name=""/>
+                    <pic:cNvPicPr/>
+                  </pic:nvPicPr>
+                  <pic:blipFill>
+                    <a:blip r:embed="rId11"/>
+                    <a:stretch>
+                      <a:fillRect/>
+                    </a:stretch>
+                  </pic:blipFill>
+                  <pic:spPr>
+                    <a:xfrm>
+                      <a:off x="0" y="0"/>
+                      <a:ext cx="5943600" cy="3343275"/>
+                    </a:xfrm>
+                    <a:prstGeom prst="rect">
+                      <a:avLst/>
+                    </a:prstGeom>
+                  </pic:spPr>
+                </pic:pic>
+              </a:graphicData>
+            </a:graphic>
+          </wp:inline>
+        </w:drawing>
+      </w:r>
+    </w:p>
+    <w:p>
+      <w:pPr>
+        <w:pStyle w:val="Heading4"/>
+        <w:rPr>
+          <w:lang w:val="en-AU"/>
+        </w:rPr>
+      </w:pPr>
+      <w:r>
+        <w:rPr>
+          <w:lang w:val="en-AU"/>
+        </w:rPr>
+        <w:drawing>
+          <wp:inline distT="0" distB="0" distL="0" distR="0" wp14:anchorId="2275089D" wp14:editId="639691BE">
+            <wp:extent cx="5943600" cy="3343275"/>
+            <wp:effectExtent l="0" t="0" r="0" b="9525"/>
+            <wp:docPr id="8" name="Picture 8"/>
+            <wp:cNvGraphicFramePr>
+              <a:graphicFrameLocks xmlns:a="http://schemas.openxmlformats.org/drawingml/2006/main" noChangeAspect="1"/>
+            </wp:cNvGraphicFramePr>
+            <a:graphic xmlns:a="http://schemas.openxmlformats.org/drawingml/2006/main">
+              <a:graphicData uri="http://schemas.openxmlformats.org/drawingml/2006/picture">
+                <pic:pic xmlns:pic="http://schemas.openxmlformats.org/drawingml/2006/picture">
+                  <pic:nvPicPr>
+                    <pic:cNvPr id="1" name=""/>
+                    <pic:cNvPicPr/>
+                  </pic:nvPicPr>
+                  <pic:blipFill>
+                    <a:blip r:embed="rId12"/>
+                    <a:stretch>
+                      <a:fillRect/>
+                    </a:stretch>
+                  </pic:blipFill>
+                  <pic:spPr>
+                    <a:xfrm>
+                      <a:off x="0" y="0"/>
+                      <a:ext cx="5943600" cy="3343275"/>
+                    </a:xfrm>
+                    <a:prstGeom prst="rect">
+                      <a:avLst/>
+                    </a:prstGeom>
+                  </pic:spPr>
+                </pic:pic>
+              </a:graphicData>
+            </a:graphic>
+          </wp:inline>
+        </w:drawing>
+      </w:r>
+    </w:p>
+    <w:p>
+      <w:pPr>
+        <w:pStyle w:val="Heading4"/>
+        <w:rPr>
+          <w:lang w:val="en-AU"/>
+        </w:rPr>
+      </w:pPr>
+    </w:p>
+    <w:p>
+      <w:pPr>
+        <w:pStyle w:val="Heading4"/>
+        <w:rPr>
+          <w:lang w:val="en-AU"/>
+        </w:rPr>
+      </w:pPr>
+      <w:r>
+        <w:rPr>
+          <w:lang w:val="en-AU"/>
+        </w:rPr>
+        <w:t>- Strategy</w:t>
+      </w:r>
+    </w:p>
+    <w:p>
+      <w:pPr>
+        <w:pStyle w:val="Heading4"/>
+        <w:rPr>
+          <w:lang w:val="en-AU"/>
+        </w:rPr>
+      </w:pPr>
+      <w:bookmarkStart w:id="3" w:name="_GoBack"/>
+      <w:bookmarkEnd w:id="3"/>
       <w:r>
         <w:rPr>
           <w:lang w:val="en-AU"/>
@@ -2291,7 +2614,7 @@
 </file>
 
 <file path=customXml/itemProps1.xml><?xml version="1.0" encoding="utf-8"?>
-<ds:datastoreItem xmlns:ds="http://schemas.openxmlformats.org/officeDocument/2006/customXml" ds:itemID="{8A936208-E90F-4713-AFAF-32968DF9F357}">
+<ds:datastoreItem xmlns:ds="http://schemas.openxmlformats.org/officeDocument/2006/customXml" ds:itemID="{E2E81FAE-59E6-4F6E-99B0-351954301A51}">
   <ds:schemaRefs>
     <ds:schemaRef ds:uri="http://schemas.openxmlformats.org/officeDocument/2006/bibliography"/>
   </ds:schemaRefs>

</xml_diff>